<commit_message>
Publica template 10047 - ARACATUBA por Marcos
</commit_message>
<xml_diff>
--- a/templates/aracatuba.docx
+++ b/templates/aracatuba.docx
@@ -11,9 +11,7 @@
         <w:rPr>
           <w:rFonts w:ascii="Arial" w:hAnsi="Arial" w:eastAsia="Arial" w:cs="Arial"/>
           <w:b/>
-          <w:i w:val="0"/>
           <w:sz w:val="20"/>
-          <w:u w:val="none"/>
         </w:rPr>
         <w:t>DECLARAÇÃO</w:t>
       </w:r>
@@ -27,9 +25,7 @@
         <w:rPr>
           <w:rFonts w:ascii="Arial" w:hAnsi="Arial" w:eastAsia="Arial" w:cs="Arial"/>
           <w:b w:val="0"/>
-          <w:i w:val="0"/>
           <w:sz w:val="20"/>
-          <w:u w:val="none"/>
         </w:rPr>
         <w:t>À</w:t>
       </w:r>
@@ -43,11 +39,9 @@
         <w:rPr>
           <w:rFonts w:ascii="Arial" w:hAnsi="Arial" w:eastAsia="Arial" w:cs="Arial"/>
           <w:b w:val="0"/>
-          <w:i w:val="0"/>
           <w:sz w:val="20"/>
-          <w:u w:val="none"/>
         </w:rPr>
-        <w:t>SINDICATO DOS TRABALHADORES DO SETOR HOTELEIRO DE SOROCABA E REGIÃO - SINTHORESSOR.</w:t>
+        <w:t>SINDICATO DOS EMPREGADOS NO COMERCIO HOTELEIRO, BARES E RESTAURANTES SIMILARES DE ARAÇATUBA E REGIÃO.</w:t>
       </w:r>
     </w:p>
     <w:p>
@@ -59,11 +53,9 @@
         <w:rPr>
           <w:rFonts w:ascii="Arial" w:hAnsi="Arial" w:eastAsia="Arial" w:cs="Arial"/>
           <w:b w:val="0"/>
-          <w:i w:val="0"/>
           <w:sz w:val="20"/>
-          <w:u w:val="none"/>
         </w:rPr>
-        <w:t xml:space="preserve">e </w:t>
+        <w:t>e</w:t>
       </w:r>
     </w:p>
     <w:p>
@@ -75,12 +67,17 @@
         <w:rPr>
           <w:rFonts w:ascii="Arial" w:hAnsi="Arial" w:eastAsia="Arial" w:cs="Arial"/>
           <w:b w:val="0"/>
-          <w:i w:val="0"/>
           <w:sz w:val="20"/>
-          <w:u w:val="none"/>
         </w:rPr>
-        <w:t xml:space="preserve">SINDICATO DE HOTÉIS, RESTAURANTES, BARES E SIMILARES DE BOTUCATU E REGIÃO – SINHORES. </w:t>
+        <w:t xml:space="preserve">SINDICATO DE HOTÉIS, RESTAURANTES, BARES E SIMILARES DE ARAÇATUBA – SINHORES. </w:t>
       </w:r>
+    </w:p>
+    <w:p>
+      <w:pPr>
+        <w:spacing w:before="0" w:after="0" w:line="240" w:lineRule="auto"/>
+        <w:jc w:val="both"/>
+      </w:pPr>
+      <w:r/>
     </w:p>
     <w:p>
       <w:pPr>
@@ -91,11 +88,49 @@
         <w:rPr>
           <w:rFonts w:ascii="Arial" w:hAnsi="Arial" w:eastAsia="Arial" w:cs="Arial"/>
           <w:b w:val="0"/>
-          <w:i w:val="0"/>
           <w:sz w:val="20"/>
-          <w:u w:val="none"/>
         </w:rPr>
+        <w:t xml:space="preserve">Declaramos que a empresa </w:t>
       </w:r>
+      <w:r>
+        <w:rPr>
+          <w:rFonts w:ascii="Arial" w:hAnsi="Arial" w:eastAsia="Arial" w:cs="Arial"/>
+          <w:b/>
+          <w:sz w:val="20"/>
+        </w:rPr>
+        <w:t>{{EMPRESA}} - {{CNPJ}}</w:t>
+      </w:r>
+      <w:r>
+        <w:rPr>
+          <w:rFonts w:ascii="Arial" w:hAnsi="Arial" w:eastAsia="Arial" w:cs="Arial"/>
+          <w:b w:val="0"/>
+          <w:sz w:val="20"/>
+        </w:rPr>
+        <w:t xml:space="preserve">, está de acordo com a ATUALIZAÇÃO da CCT de Araçatuba e Região, tendo contrato o </w:t>
+      </w:r>
+      <w:r>
+        <w:rPr>
+          <w:rFonts w:ascii="Arial" w:hAnsi="Arial" w:eastAsia="Arial" w:cs="Arial"/>
+          <w:b/>
+          <w:sz w:val="20"/>
+        </w:rPr>
+        <w:t>{{BLOCO_BENEFICIOS}}</w:t>
+      </w:r>
+      <w:r>
+        <w:rPr>
+          <w:rFonts w:ascii="Arial" w:hAnsi="Arial" w:eastAsia="Arial" w:cs="Arial"/>
+          <w:b w:val="0"/>
+          <w:sz w:val="20"/>
+        </w:rPr>
+        <w:t xml:space="preserve"> os quais atendem na íntegra a CLÁUSULA CESTA DE BENEFÍCIOS. </w:t>
+      </w:r>
+    </w:p>
+    <w:p>
+      <w:pPr>
+        <w:spacing w:before="0" w:after="0" w:line="240" w:lineRule="auto"/>
+        <w:jc w:val="both"/>
+      </w:pPr>
+      <w:r/>
     </w:p>
     <w:p>
       <w:pPr>
@@ -106,72 +141,17 @@
         <w:rPr>
           <w:rFonts w:ascii="Arial" w:hAnsi="Arial" w:eastAsia="Arial" w:cs="Arial"/>
           <w:b w:val="0"/>
-          <w:i w:val="0"/>
           <w:sz w:val="20"/>
-          <w:u w:val="none"/>
         </w:rPr>
-        <w:t xml:space="preserve">Declaramos que a empresa </w:t>
+        <w:t xml:space="preserve">A ATUALIZAÇÃO da apólice foi formalizada mediante o pagamento do boleto pago em {{PAGTO}}. </w:t>
       </w:r>
-      <w:r>
-        <w:rPr>
-          <w:rFonts w:ascii="Arial" w:hAnsi="Arial" w:eastAsia="Arial" w:cs="Arial"/>
-          <w:b w:val="0"/>
-          <w:i w:val="0"/>
-          <w:sz w:val="20"/>
-          <w:u w:val="none"/>
-        </w:rPr>
-        <w:t>{{EMPRESA}}</w:t>
-      </w:r>
-      <w:r>
-        <w:rPr>
-          <w:rFonts w:ascii="Arial" w:hAnsi="Arial" w:eastAsia="Arial" w:cs="Arial"/>
-          <w:b/>
-          <w:i w:val="0"/>
-          <w:sz w:val="20"/>
-          <w:u w:val="none"/>
-        </w:rPr>
-        <w:t xml:space="preserve"> - </w:t>
-      </w:r>
-      <w:r>
-        <w:rPr>
-          <w:rFonts w:ascii="Arial" w:hAnsi="Arial" w:eastAsia="Arial" w:cs="Arial"/>
-          <w:b w:val="0"/>
-          <w:i w:val="0"/>
-          <w:sz w:val="20"/>
-          <w:u w:val="none"/>
-        </w:rPr>
-        <w:t>{{CNPJ}}</w:t>
-      </w:r>
-      <w:r>
-        <w:rPr>
-          <w:rFonts w:ascii="Arial" w:hAnsi="Arial" w:eastAsia="Arial" w:cs="Arial"/>
-          <w:b w:val="0"/>
-          <w:i w:val="0"/>
-          <w:sz w:val="20"/>
-          <w:u w:val="none"/>
-        </w:rPr>
-        <w:t xml:space="preserve">, está de acordo com a ATUALIZAÇÃO da CCT de Botucatu e Região, tendo contratado o </w:t>
-      </w:r>
-      <w:r>
-        <w:rPr>
-          <w:rFonts w:ascii="Arial" w:hAnsi="Arial" w:eastAsia="Arial" w:cs="Arial"/>
-          <w:b w:val="0"/>
-          <w:i w:val="0"/>
-          <w:sz w:val="20"/>
-          <w:u w:val="none"/>
-        </w:rPr>
-        <w:t>{{BLOCO_BENEFICIOS}}</w:t>
-      </w:r>
-      <w:r>
-        <w:rPr>
-          <w:rFonts w:ascii="Arial" w:hAnsi="Arial" w:eastAsia="Arial" w:cs="Arial"/>
-          <w:b w:val="0"/>
-          <w:i w:val="0"/>
-          <w:sz w:val="20"/>
-          <w:u w:val="none"/>
-        </w:rPr>
-        <w:t xml:space="preserve"> os quais atendem na íntegra a CLÁUSULA CESTA DE BENEFÍCIOS. </w:t>
-      </w:r>
+    </w:p>
+    <w:p>
+      <w:pPr>
+        <w:spacing w:before="0" w:after="0" w:line="240" w:lineRule="auto"/>
+        <w:jc w:val="both"/>
+      </w:pPr>
+      <w:r/>
     </w:p>
     <w:p>
       <w:pPr>
@@ -182,11 +162,17 @@
         <w:rPr>
           <w:rFonts w:ascii="Arial" w:hAnsi="Arial" w:eastAsia="Arial" w:cs="Arial"/>
           <w:b w:val="0"/>
-          <w:i w:val="0"/>
           <w:sz w:val="20"/>
-          <w:u w:val="none"/>
         </w:rPr>
+        <w:t xml:space="preserve">Informamos que a nova apólice do Seguro de Vida com Telemedicina por vídeo chamada, assim como o Resumo de Fatura do Plano Odontológico e as respectivas carteirinhas estão, atualmente, em processo de emissão junto à Seguradora. Tão logo estejam disponíveis, serão prontamente encaminhados ao e-mail do nosso estimado cliente. </w:t>
       </w:r>
+    </w:p>
+    <w:p>
+      <w:pPr>
+        <w:spacing w:before="0" w:after="0" w:line="240" w:lineRule="auto"/>
+        <w:jc w:val="both"/>
+      </w:pPr>
+      <w:r/>
     </w:p>
     <w:p>
       <w:pPr>
@@ -197,32 +183,17 @@
         <w:rPr>
           <w:rFonts w:ascii="Arial" w:hAnsi="Arial" w:eastAsia="Arial" w:cs="Arial"/>
           <w:b w:val="0"/>
-          <w:i w:val="0"/>
           <w:sz w:val="20"/>
-          <w:u w:val="none"/>
         </w:rPr>
-        <w:t xml:space="preserve">A ATUALIZAÇÃO da apólice foi formalizada mediante o pagamento do boleto pago em </w:t>
+        <w:t xml:space="preserve">A Cesta de Benefícios está ativa para os colaboradores abaixo: </w:t>
       </w:r>
-      <w:r>
-        <w:rPr>
-          <w:rFonts w:ascii="Arial" w:hAnsi="Arial" w:eastAsia="Arial" w:cs="Arial"/>
-          <w:b w:val="0"/>
-          <w:i w:val="0"/>
-          <w:sz w:val="20"/>
-          <w:u w:val="none"/>
-        </w:rPr>
-        <w:t>{{PAGTO}}</w:t>
-      </w:r>
-      <w:r>
-        <w:rPr>
-          <w:rFonts w:ascii="Arial" w:hAnsi="Arial" w:eastAsia="Arial" w:cs="Arial"/>
-          <w:b w:val="0"/>
-          <w:i w:val="0"/>
-          <w:sz w:val="20"/>
-          <w:u w:val="none"/>
-        </w:rPr>
-        <w:t xml:space="preserve">. </w:t>
-      </w:r>
+    </w:p>
+    <w:p>
+      <w:pPr>
+        <w:spacing w:before="0" w:after="0" w:line="240" w:lineRule="auto"/>
+        <w:jc w:val="both"/>
+      </w:pPr>
+      <w:r/>
     </w:p>
     <w:p>
       <w:pPr>
@@ -233,86 +204,7 @@
         <w:rPr>
           <w:rFonts w:ascii="Arial" w:hAnsi="Arial" w:eastAsia="Arial" w:cs="Arial"/>
           <w:b w:val="0"/>
-          <w:i w:val="0"/>
           <w:sz w:val="20"/>
-          <w:u w:val="none"/>
-        </w:rPr>
-      </w:r>
-    </w:p>
-    <w:p>
-      <w:pPr>
-        <w:spacing w:before="0" w:after="0" w:line="240" w:lineRule="auto"/>
-        <w:jc w:val="both"/>
-      </w:pPr>
-      <w:r>
-        <w:rPr>
-          <w:rFonts w:ascii="Arial" w:hAnsi="Arial" w:eastAsia="Arial" w:cs="Arial"/>
-          <w:b w:val="0"/>
-          <w:i w:val="0"/>
-          <w:sz w:val="20"/>
-          <w:u w:val="none"/>
-        </w:rPr>
-        <w:t xml:space="preserve">Informamos que a nova apólice do Seguro de Vida com Telemedicina por vídeo chamada, assim como o Resumo de Fatura do Plano Odontológico e as respectivas carteirinhas estão, atualmente, em processo de emissão junto à Seguradora. Tão logo estejam disponíveis, serão prontamente encaminhados ao e-mail do nosso estimado cliente. </w:t>
-      </w:r>
-    </w:p>
-    <w:p>
-      <w:pPr>
-        <w:spacing w:before="0" w:after="0" w:line="240" w:lineRule="auto"/>
-        <w:jc w:val="both"/>
-      </w:pPr>
-      <w:r>
-        <w:rPr>
-          <w:rFonts w:ascii="Arial" w:hAnsi="Arial" w:eastAsia="Arial" w:cs="Arial"/>
-          <w:b w:val="0"/>
-          <w:i w:val="0"/>
-          <w:sz w:val="20"/>
-          <w:u w:val="none"/>
-        </w:rPr>
-      </w:r>
-    </w:p>
-    <w:p>
-      <w:pPr>
-        <w:spacing w:before="0" w:after="0" w:line="240" w:lineRule="auto"/>
-        <w:jc w:val="both"/>
-      </w:pPr>
-      <w:r>
-        <w:rPr>
-          <w:rFonts w:ascii="Arial" w:hAnsi="Arial" w:eastAsia="Arial" w:cs="Arial"/>
-          <w:b w:val="0"/>
-          <w:i w:val="0"/>
-          <w:sz w:val="20"/>
-          <w:u w:val="none"/>
-        </w:rPr>
-        <w:t xml:space="preserve">A Cesta de Benefícios está ativa para os colaboradores abaixo: </w:t>
-      </w:r>
-    </w:p>
-    <w:p>
-      <w:pPr>
-        <w:spacing w:before="0" w:after="0" w:line="240" w:lineRule="auto"/>
-        <w:jc w:val="both"/>
-      </w:pPr>
-      <w:r>
-        <w:rPr>
-          <w:rFonts w:ascii="Arial" w:hAnsi="Arial" w:eastAsia="Arial" w:cs="Arial"/>
-          <w:b w:val="0"/>
-          <w:i w:val="0"/>
-          <w:sz w:val="20"/>
-          <w:u w:val="none"/>
-        </w:rPr>
-      </w:r>
-    </w:p>
-    <w:p>
-      <w:pPr>
-        <w:spacing w:before="0" w:after="0" w:line="240" w:lineRule="auto"/>
-        <w:jc w:val="both"/>
-      </w:pPr>
-      <w:r>
-        <w:rPr>
-          <w:rFonts w:ascii="Arial" w:hAnsi="Arial" w:eastAsia="Arial" w:cs="Arial"/>
-          <w:b w:val="0"/>
-          <w:i w:val="0"/>
-          <w:sz w:val="20"/>
-          <w:u w:val="none"/>
         </w:rPr>
         <w:t>{{LISTA_ATIVOS}}</w:t>
       </w:r>
@@ -326,21 +218,9 @@
         <w:rPr>
           <w:rFonts w:ascii="Arial" w:hAnsi="Arial" w:eastAsia="Arial" w:cs="Arial"/>
           <w:b w:val="0"/>
-          <w:i w:val="0"/>
           <w:sz w:val="20"/>
-          <w:u w:val="none"/>
         </w:rPr>
-        <w:t xml:space="preserve">São Paulo, </w:t>
-      </w:r>
-      <w:r>
-        <w:rPr>
-          <w:rFonts w:ascii="Arial" w:hAnsi="Arial" w:eastAsia="Arial" w:cs="Arial"/>
-          <w:b w:val="0"/>
-          <w:i w:val="0"/>
-          <w:sz w:val="20"/>
-          <w:u w:val="none"/>
-        </w:rPr>
-        <w:t>{{DATA_HOJE}}</w:t>
+        <w:t>São Paulo, {{DATA_HOJE}}</w:t>
       </w:r>
     </w:p>
     <w:p>
@@ -352,9 +232,7 @@
         <w:rPr>
           <w:rFonts w:ascii="Arial" w:hAnsi="Arial" w:eastAsia="Arial" w:cs="Arial"/>
           <w:b w:val="0"/>
-          <w:i w:val="0"/>
           <w:sz w:val="20"/>
-          <w:u w:val="none"/>
         </w:rPr>
         <w:t>{{ASSINATURA}}</w:t>
       </w:r>

</xml_diff>

<commit_message>
Publica template 10041 - BOTUCATU por Marcos
</commit_message>
<xml_diff>
--- a/templates/aracatuba.docx
+++ b/templates/aracatuba.docx
@@ -11,7 +11,9 @@
         <w:rPr>
           <w:rFonts w:ascii="Arial" w:hAnsi="Arial" w:eastAsia="Arial" w:cs="Arial"/>
           <w:b/>
+          <w:i w:val="0"/>
           <w:sz w:val="20"/>
+          <w:u w:val="none"/>
         </w:rPr>
         <w:t>DECLARAÇÃO</w:t>
       </w:r>
@@ -25,7 +27,9 @@
         <w:rPr>
           <w:rFonts w:ascii="Arial" w:hAnsi="Arial" w:eastAsia="Arial" w:cs="Arial"/>
           <w:b w:val="0"/>
+          <w:i w:val="0"/>
           <w:sz w:val="20"/>
+          <w:u w:val="none"/>
         </w:rPr>
         <w:t>À</w:t>
       </w:r>
@@ -39,9 +43,11 @@
         <w:rPr>
           <w:rFonts w:ascii="Arial" w:hAnsi="Arial" w:eastAsia="Arial" w:cs="Arial"/>
           <w:b w:val="0"/>
+          <w:i w:val="0"/>
           <w:sz w:val="20"/>
+          <w:u w:val="none"/>
         </w:rPr>
-        <w:t>SINDICATO DOS EMPREGADOS NO COMERCIO HOTELEIRO, BARES E RESTAURANTES SIMILARES DE ARAÇATUBA E REGIÃO.</w:t>
+        <w:t>SINDICATO DOS TRABALHADORES DO SETOR HOTELEIRO DE SOROCABA E REGIÃO - SINTHORESSOR.</w:t>
       </w:r>
     </w:p>
     <w:p>
@@ -53,9 +59,11 @@
         <w:rPr>
           <w:rFonts w:ascii="Arial" w:hAnsi="Arial" w:eastAsia="Arial" w:cs="Arial"/>
           <w:b w:val="0"/>
+          <w:i w:val="0"/>
           <w:sz w:val="20"/>
+          <w:u w:val="none"/>
         </w:rPr>
-        <w:t>e</w:t>
+        <w:t xml:space="preserve">e </w:t>
       </w:r>
     </w:p>
     <w:p>
@@ -67,17 +75,12 @@
         <w:rPr>
           <w:rFonts w:ascii="Arial" w:hAnsi="Arial" w:eastAsia="Arial" w:cs="Arial"/>
           <w:b w:val="0"/>
+          <w:i w:val="0"/>
           <w:sz w:val="20"/>
+          <w:u w:val="none"/>
         </w:rPr>
-        <w:t xml:space="preserve">SINDICATO DE HOTÉIS, RESTAURANTES, BARES E SIMILARES DE ARAÇATUBA – SINHORES. </w:t>
+        <w:t xml:space="preserve">SINDICATO DE HOTÉIS, RESTAURANTES, BARES E SIMILARES DE BOTUCATU E REGIÃO – SINHORES. </w:t>
       </w:r>
-    </w:p>
-    <w:p>
-      <w:pPr>
-        <w:spacing w:before="0" w:after="0" w:line="240" w:lineRule="auto"/>
-        <w:jc w:val="both"/>
-      </w:pPr>
-      <w:r/>
     </w:p>
     <w:p>
       <w:pPr>
@@ -88,49 +91,11 @@
         <w:rPr>
           <w:rFonts w:ascii="Arial" w:hAnsi="Arial" w:eastAsia="Arial" w:cs="Arial"/>
           <w:b w:val="0"/>
+          <w:i w:val="0"/>
           <w:sz w:val="20"/>
+          <w:u w:val="none"/>
         </w:rPr>
-        <w:t xml:space="preserve">Declaramos que a empresa </w:t>
       </w:r>
-      <w:r>
-        <w:rPr>
-          <w:rFonts w:ascii="Arial" w:hAnsi="Arial" w:eastAsia="Arial" w:cs="Arial"/>
-          <w:b/>
-          <w:sz w:val="20"/>
-        </w:rPr>
-        <w:t>{{EMPRESA}} - {{CNPJ}}</w:t>
-      </w:r>
-      <w:r>
-        <w:rPr>
-          <w:rFonts w:ascii="Arial" w:hAnsi="Arial" w:eastAsia="Arial" w:cs="Arial"/>
-          <w:b w:val="0"/>
-          <w:sz w:val="20"/>
-        </w:rPr>
-        <w:t xml:space="preserve">, está de acordo com a ATUALIZAÇÃO da CCT de Araçatuba e Região, tendo contrato o </w:t>
-      </w:r>
-      <w:r>
-        <w:rPr>
-          <w:rFonts w:ascii="Arial" w:hAnsi="Arial" w:eastAsia="Arial" w:cs="Arial"/>
-          <w:b/>
-          <w:sz w:val="20"/>
-        </w:rPr>
-        <w:t>{{BLOCO_BENEFICIOS}}</w:t>
-      </w:r>
-      <w:r>
-        <w:rPr>
-          <w:rFonts w:ascii="Arial" w:hAnsi="Arial" w:eastAsia="Arial" w:cs="Arial"/>
-          <w:b w:val="0"/>
-          <w:sz w:val="20"/>
-        </w:rPr>
-        <w:t xml:space="preserve"> os quais atendem na íntegra a CLÁUSULA CESTA DE BENEFÍCIOS. </w:t>
-      </w:r>
-    </w:p>
-    <w:p>
-      <w:pPr>
-        <w:spacing w:before="0" w:after="0" w:line="240" w:lineRule="auto"/>
-        <w:jc w:val="both"/>
-      </w:pPr>
-      <w:r/>
     </w:p>
     <w:p>
       <w:pPr>
@@ -141,17 +106,72 @@
         <w:rPr>
           <w:rFonts w:ascii="Arial" w:hAnsi="Arial" w:eastAsia="Arial" w:cs="Arial"/>
           <w:b w:val="0"/>
+          <w:i w:val="0"/>
           <w:sz w:val="20"/>
+          <w:u w:val="none"/>
         </w:rPr>
-        <w:t xml:space="preserve">A ATUALIZAÇÃO da apólice foi formalizada mediante o pagamento do boleto pago em {{PAGTO}}. </w:t>
+        <w:t xml:space="preserve">Declaramos que a empresa </w:t>
       </w:r>
-    </w:p>
-    <w:p>
-      <w:pPr>
-        <w:spacing w:before="0" w:after="0" w:line="240" w:lineRule="auto"/>
-        <w:jc w:val="both"/>
-      </w:pPr>
-      <w:r/>
+      <w:r>
+        <w:rPr>
+          <w:rFonts w:ascii="Arial" w:hAnsi="Arial" w:eastAsia="Arial" w:cs="Arial"/>
+          <w:b w:val="0"/>
+          <w:i w:val="0"/>
+          <w:sz w:val="20"/>
+          <w:u w:val="none"/>
+        </w:rPr>
+        <w:t>{{EMPRESA}}</w:t>
+      </w:r>
+      <w:r>
+        <w:rPr>
+          <w:rFonts w:ascii="Arial" w:hAnsi="Arial" w:eastAsia="Arial" w:cs="Arial"/>
+          <w:b/>
+          <w:i w:val="0"/>
+          <w:sz w:val="20"/>
+          <w:u w:val="none"/>
+        </w:rPr>
+        <w:t xml:space="preserve"> - </w:t>
+      </w:r>
+      <w:r>
+        <w:rPr>
+          <w:rFonts w:ascii="Arial" w:hAnsi="Arial" w:eastAsia="Arial" w:cs="Arial"/>
+          <w:b w:val="0"/>
+          <w:i w:val="0"/>
+          <w:sz w:val="20"/>
+          <w:u w:val="none"/>
+        </w:rPr>
+        <w:t>{{CNPJ}}</w:t>
+      </w:r>
+      <w:r>
+        <w:rPr>
+          <w:rFonts w:ascii="Arial" w:hAnsi="Arial" w:eastAsia="Arial" w:cs="Arial"/>
+          <w:b w:val="0"/>
+          <w:i w:val="0"/>
+          <w:sz w:val="20"/>
+          <w:u w:val="none"/>
+        </w:rPr>
+        <w:t xml:space="preserve">, está de acordo com a ATUALIZAÇÃO da CCT de Botucatu e Região, tendo contratado o </w:t>
+      </w:r>
+      <w:r>
+        <w:rPr>
+          <w:rFonts w:ascii="Arial" w:hAnsi="Arial" w:eastAsia="Arial" w:cs="Arial"/>
+          <w:b w:val="0"/>
+          <w:i w:val="0"/>
+          <w:sz w:val="20"/>
+          <w:u w:val="none"/>
+        </w:rPr>
+        <w:t>{{BLOCO_BENEFICIOS}}</w:t>
+      </w:r>
+      <w:r>
+        <w:rPr>
+          <w:rFonts w:ascii="Arial" w:hAnsi="Arial" w:eastAsia="Arial" w:cs="Arial"/>
+          <w:b w:val="0"/>
+          <w:i w:val="0"/>
+          <w:sz w:val="20"/>
+          <w:u w:val="none"/>
+        </w:rPr>
+        <w:t xml:space="preserve"> os quais atendem na íntegra a CLÁUSULA CESTA DE BENEFÍCIOS. </w:t>
+      </w:r>
     </w:p>
     <w:p>
       <w:pPr>
@@ -162,17 +182,11 @@
         <w:rPr>
           <w:rFonts w:ascii="Arial" w:hAnsi="Arial" w:eastAsia="Arial" w:cs="Arial"/>
           <w:b w:val="0"/>
+          <w:i w:val="0"/>
           <w:sz w:val="20"/>
+          <w:u w:val="none"/>
         </w:rPr>
-        <w:t xml:space="preserve">Informamos que a nova apólice do Seguro de Vida com Telemedicina por vídeo chamada, assim como o Resumo de Fatura do Plano Odontológico e as respectivas carteirinhas estão, atualmente, em processo de emissão junto à Seguradora. Tão logo estejam disponíveis, serão prontamente encaminhados ao e-mail do nosso estimado cliente. </w:t>
       </w:r>
-    </w:p>
-    <w:p>
-      <w:pPr>
-        <w:spacing w:before="0" w:after="0" w:line="240" w:lineRule="auto"/>
-        <w:jc w:val="both"/>
-      </w:pPr>
-      <w:r/>
     </w:p>
     <w:p>
       <w:pPr>
@@ -183,17 +197,32 @@
         <w:rPr>
           <w:rFonts w:ascii="Arial" w:hAnsi="Arial" w:eastAsia="Arial" w:cs="Arial"/>
           <w:b w:val="0"/>
+          <w:i w:val="0"/>
           <w:sz w:val="20"/>
+          <w:u w:val="none"/>
         </w:rPr>
-        <w:t xml:space="preserve">A Cesta de Benefícios está ativa para os colaboradores abaixo: </w:t>
+        <w:t xml:space="preserve">A ATUALIZAÇÃO da apólice foi formalizada mediante o pagamento do boleto pago em </w:t>
       </w:r>
-    </w:p>
-    <w:p>
-      <w:pPr>
-        <w:spacing w:before="0" w:after="0" w:line="240" w:lineRule="auto"/>
-        <w:jc w:val="both"/>
-      </w:pPr>
-      <w:r/>
+      <w:r>
+        <w:rPr>
+          <w:rFonts w:ascii="Arial" w:hAnsi="Arial" w:eastAsia="Arial" w:cs="Arial"/>
+          <w:b w:val="0"/>
+          <w:i w:val="0"/>
+          <w:sz w:val="20"/>
+          <w:u w:val="none"/>
+        </w:rPr>
+        <w:t>{{PAGTO}}</w:t>
+      </w:r>
+      <w:r>
+        <w:rPr>
+          <w:rFonts w:ascii="Arial" w:hAnsi="Arial" w:eastAsia="Arial" w:cs="Arial"/>
+          <w:b w:val="0"/>
+          <w:i w:val="0"/>
+          <w:sz w:val="20"/>
+          <w:u w:val="none"/>
+        </w:rPr>
+        <w:t xml:space="preserve">. </w:t>
+      </w:r>
     </w:p>
     <w:p>
       <w:pPr>
@@ -204,7 +233,86 @@
         <w:rPr>
           <w:rFonts w:ascii="Arial" w:hAnsi="Arial" w:eastAsia="Arial" w:cs="Arial"/>
           <w:b w:val="0"/>
+          <w:i w:val="0"/>
           <w:sz w:val="20"/>
+          <w:u w:val="none"/>
+        </w:rPr>
+      </w:r>
+    </w:p>
+    <w:p>
+      <w:pPr>
+        <w:spacing w:before="0" w:after="0" w:line="240" w:lineRule="auto"/>
+        <w:jc w:val="both"/>
+      </w:pPr>
+      <w:r>
+        <w:rPr>
+          <w:rFonts w:ascii="Arial" w:hAnsi="Arial" w:eastAsia="Arial" w:cs="Arial"/>
+          <w:b w:val="0"/>
+          <w:i w:val="0"/>
+          <w:sz w:val="20"/>
+          <w:u w:val="none"/>
+        </w:rPr>
+        <w:t xml:space="preserve">Informamos que a nova apólice do Seguro de Vida com Telemedicina por vídeo chamada, assim como o Resumo de Fatura do Plano Odontológico e as respectivas carteirinhas estão, atualmente, em processo de emissão junto à Seguradora. Tão logo estejam disponíveis, serão prontamente encaminhados ao e-mail do nosso estimado cliente. </w:t>
+      </w:r>
+    </w:p>
+    <w:p>
+      <w:pPr>
+        <w:spacing w:before="0" w:after="0" w:line="240" w:lineRule="auto"/>
+        <w:jc w:val="both"/>
+      </w:pPr>
+      <w:r>
+        <w:rPr>
+          <w:rFonts w:ascii="Arial" w:hAnsi="Arial" w:eastAsia="Arial" w:cs="Arial"/>
+          <w:b w:val="0"/>
+          <w:i w:val="0"/>
+          <w:sz w:val="20"/>
+          <w:u w:val="none"/>
+        </w:rPr>
+      </w:r>
+    </w:p>
+    <w:p>
+      <w:pPr>
+        <w:spacing w:before="0" w:after="0" w:line="240" w:lineRule="auto"/>
+        <w:jc w:val="both"/>
+      </w:pPr>
+      <w:r>
+        <w:rPr>
+          <w:rFonts w:ascii="Arial" w:hAnsi="Arial" w:eastAsia="Arial" w:cs="Arial"/>
+          <w:b w:val="0"/>
+          <w:i w:val="0"/>
+          <w:sz w:val="20"/>
+          <w:u w:val="none"/>
+        </w:rPr>
+        <w:t xml:space="preserve">A Cesta de Benefícios está ativa para os colaboradores abaixo: </w:t>
+      </w:r>
+    </w:p>
+    <w:p>
+      <w:pPr>
+        <w:spacing w:before="0" w:after="0" w:line="240" w:lineRule="auto"/>
+        <w:jc w:val="both"/>
+      </w:pPr>
+      <w:r>
+        <w:rPr>
+          <w:rFonts w:ascii="Arial" w:hAnsi="Arial" w:eastAsia="Arial" w:cs="Arial"/>
+          <w:b w:val="0"/>
+          <w:i w:val="0"/>
+          <w:sz w:val="20"/>
+          <w:u w:val="none"/>
+        </w:rPr>
+      </w:r>
+    </w:p>
+    <w:p>
+      <w:pPr>
+        <w:spacing w:before="0" w:after="0" w:line="240" w:lineRule="auto"/>
+        <w:jc w:val="both"/>
+      </w:pPr>
+      <w:r>
+        <w:rPr>
+          <w:rFonts w:ascii="Arial" w:hAnsi="Arial" w:eastAsia="Arial" w:cs="Arial"/>
+          <w:b w:val="0"/>
+          <w:i w:val="0"/>
+          <w:sz w:val="20"/>
+          <w:u w:val="none"/>
         </w:rPr>
         <w:t>{{LISTA_ATIVOS}}</w:t>
       </w:r>
@@ -218,9 +326,21 @@
         <w:rPr>
           <w:rFonts w:ascii="Arial" w:hAnsi="Arial" w:eastAsia="Arial" w:cs="Arial"/>
           <w:b w:val="0"/>
+          <w:i w:val="0"/>
           <w:sz w:val="20"/>
+          <w:u w:val="none"/>
         </w:rPr>
-        <w:t>São Paulo, {{DATA_HOJE}}</w:t>
+        <w:t xml:space="preserve">São Paulo, </w:t>
+      </w:r>
+      <w:r>
+        <w:rPr>
+          <w:rFonts w:ascii="Arial" w:hAnsi="Arial" w:eastAsia="Arial" w:cs="Arial"/>
+          <w:b w:val="0"/>
+          <w:i w:val="0"/>
+          <w:sz w:val="20"/>
+          <w:u w:val="none"/>
+        </w:rPr>
+        <w:t>{{DATA_HOJE}}</w:t>
       </w:r>
     </w:p>
     <w:p>
@@ -232,7 +352,9 @@
         <w:rPr>
           <w:rFonts w:ascii="Arial" w:hAnsi="Arial" w:eastAsia="Arial" w:cs="Arial"/>
           <w:b w:val="0"/>
+          <w:i w:val="0"/>
           <w:sz w:val="20"/>
+          <w:u w:val="none"/>
         </w:rPr>
         <w:t>{{ASSINATURA}}</w:t>
       </w:r>

</xml_diff>